<commit_message>
Se haccen varios cambios en el servidor MCP, se cambian casi todos los metadatos para obtener un mejor summary, se corrige error en donde el summary no mostraba los parámetros de entrada y de salida correctamente, se observa que el summary aún no es del todo claro, se planean estrategias para mejorarlo.
</commit_message>
<xml_diff>
--- a/Avances_Proyecto/Prueba de signatures/Prueba de signature RECEPTOR o RAG inicial.docx
+++ b/Avances_Proyecto/Prueba de signatures/Prueba de signature RECEPTOR o RAG inicial.docx
@@ -244,29 +244,23 @@
         <w:rPr>
           <w:b/>
           <w:bCs/>
-        </w:rPr>
-      </w:pPr>
-      <w:proofErr w:type="spellStart"/>
-      <w:r>
-        <w:rPr>
-          <w:b/>
-          <w:bCs/>
-        </w:rPr>
-        <w:t>class</w:t>
-      </w:r>
-      <w:proofErr w:type="spellEnd"/>
-      <w:r>
-        <w:rPr>
-          <w:b/>
-          <w:bCs/>
-        </w:rPr>
-        <w:t xml:space="preserve"> </w:t>
-      </w:r>
-      <w:proofErr w:type="spellStart"/>
-      <w:r>
-        <w:rPr>
-          <w:b/>
-          <w:bCs/>
+          <w:lang w:val="en-US"/>
+        </w:rPr>
+      </w:pPr>
+      <w:r>
+        <w:rPr>
+          <w:b/>
+          <w:bCs/>
+          <w:lang w:val="en-US"/>
+        </w:rPr>
+        <w:t xml:space="preserve">class </w:t>
+      </w:r>
+      <w:proofErr w:type="spellStart"/>
+      <w:r>
+        <w:rPr>
+          <w:b/>
+          <w:bCs/>
+          <w:lang w:val="en-US"/>
         </w:rPr>
         <w:t>Rag_Generator</w:t>
       </w:r>
@@ -275,6 +269,7 @@
         <w:rPr>
           <w:b/>
           <w:bCs/>
+          <w:lang w:val="en-US"/>
         </w:rPr>
         <w:t>(</w:t>
       </w:r>
@@ -286,6 +281,7 @@
           <w:bCs/>
           <w:i/>
           <w:iCs/>
+          <w:lang w:val="en-US"/>
         </w:rPr>
         <w:t>dspy</w:t>
       </w:r>
@@ -293,6 +289,7 @@
         <w:rPr>
           <w:b/>
           <w:bCs/>
+          <w:lang w:val="en-US"/>
         </w:rPr>
         <w:t>.Signature</w:t>
       </w:r>
@@ -302,6 +299,7 @@
         <w:rPr>
           <w:b/>
           <w:bCs/>
+          <w:lang w:val="en-US"/>
         </w:rPr>
         <w:t>)</w:t>
       </w:r>
@@ -317,6 +315,7 @@
         <w:rPr>
           <w:b/>
           <w:bCs/>
+          <w:lang w:val="en-US"/>
         </w:rPr>
         <w:t xml:space="preserve">    </w:t>
       </w:r>
@@ -1074,6 +1073,7 @@
         <w:rPr>
           <w:b/>
           <w:bCs/>
+          <w:lang w:val="en-US"/>
         </w:rPr>
       </w:pPr>
       <w:r>
@@ -1088,6 +1088,7 @@
         <w:rPr>
           <w:b/>
           <w:bCs/>
+          <w:lang w:val="en-US"/>
         </w:rPr>
         <w:t>intenciones_principales</w:t>
       </w:r>
@@ -1096,74 +1097,45 @@
         <w:rPr>
           <w:b/>
           <w:bCs/>
+          <w:lang w:val="en-US"/>
         </w:rPr>
         <w:t xml:space="preserve">: </w:t>
       </w:r>
-      <w:proofErr w:type="spellStart"/>
       <w:proofErr w:type="gramStart"/>
       <w:r>
         <w:rPr>
           <w:b/>
           <w:bCs/>
-        </w:rPr>
-        <w:t>List</w:t>
-      </w:r>
-      <w:proofErr w:type="spellEnd"/>
-      <w:r>
-        <w:rPr>
-          <w:b/>
-          <w:bCs/>
+          <w:lang w:val="en-US"/>
+        </w:rPr>
+        <w:t>List[</w:t>
+      </w:r>
+      <w:proofErr w:type="spellStart"/>
+      <w:r>
+        <w:rPr>
+          <w:b/>
+          <w:bCs/>
+          <w:lang w:val="en-US"/>
+        </w:rPr>
+        <w:t>Dict</w:t>
+      </w:r>
+      <w:proofErr w:type="spellEnd"/>
+      <w:r>
+        <w:rPr>
+          <w:b/>
+          <w:bCs/>
+          <w:lang w:val="en-US"/>
         </w:rPr>
         <w:t>[</w:t>
       </w:r>
-      <w:proofErr w:type="spellStart"/>
-      <w:r>
-        <w:rPr>
-          <w:b/>
-          <w:bCs/>
-        </w:rPr>
-        <w:t>Dict</w:t>
-      </w:r>
-      <w:proofErr w:type="spellEnd"/>
-      <w:r>
-        <w:rPr>
-          <w:b/>
-          <w:bCs/>
-        </w:rPr>
-        <w:t>[</w:t>
-      </w:r>
-      <w:proofErr w:type="spellStart"/>
       <w:proofErr w:type="gramEnd"/>
       <w:r>
         <w:rPr>
           <w:b/>
           <w:bCs/>
-        </w:rPr>
-        <w:t>str</w:t>
-      </w:r>
-      <w:proofErr w:type="spellEnd"/>
-      <w:r>
-        <w:rPr>
-          <w:b/>
-          <w:bCs/>
-        </w:rPr>
-        <w:t xml:space="preserve">, </w:t>
-      </w:r>
-      <w:proofErr w:type="spellStart"/>
-      <w:r>
-        <w:rPr>
-          <w:b/>
-          <w:bCs/>
-        </w:rPr>
-        <w:t>Any</w:t>
-      </w:r>
-      <w:proofErr w:type="spellEnd"/>
-      <w:r>
-        <w:rPr>
-          <w:b/>
-          <w:bCs/>
-        </w:rPr>
-        <w:t xml:space="preserve">]] = </w:t>
+          <w:lang w:val="en-US"/>
+        </w:rPr>
+        <w:t xml:space="preserve">str, Any]] = </w:t>
       </w:r>
       <w:proofErr w:type="spellStart"/>
       <w:proofErr w:type="gramStart"/>
@@ -1171,6 +1143,7 @@
         <w:rPr>
           <w:b/>
           <w:bCs/>
+          <w:lang w:val="en-US"/>
         </w:rPr>
         <w:t>dspy.OutputField</w:t>
       </w:r>
@@ -1180,6 +1153,7 @@
         <w:rPr>
           <w:b/>
           <w:bCs/>
+          <w:lang w:val="en-US"/>
         </w:rPr>
         <w:t>(</w:t>
       </w:r>
@@ -1195,6 +1169,7 @@
         <w:rPr>
           <w:b/>
           <w:bCs/>
+          <w:lang w:val="en-US"/>
         </w:rPr>
         <w:t xml:space="preserve">    </w:t>
       </w:r>
@@ -1254,6 +1229,7 @@
         <w:rPr>
           <w:b/>
           <w:bCs/>
+          <w:lang w:val="en-US"/>
         </w:rPr>
       </w:pPr>
       <w:r>
@@ -1267,30 +1243,34 @@
         <w:rPr>
           <w:b/>
           <w:bCs/>
-        </w:rPr>
-        <w:t xml:space="preserve">"- id: </w:t>
-      </w:r>
-      <w:proofErr w:type="spellStart"/>
-      <w:r>
-        <w:rPr>
-          <w:b/>
-          <w:bCs/>
-        </w:rPr>
-        <w:t>str</w:t>
-      </w:r>
-      <w:proofErr w:type="spellEnd"/>
-      <w:r>
-        <w:rPr>
-          <w:b/>
-          <w:bCs/>
-        </w:rPr>
-        <w:t xml:space="preserve"> (formato 'a0', 'a1', </w:t>
+          <w:lang w:val="en-US"/>
+        </w:rPr>
+        <w:t>"- id: str (</w:t>
+      </w:r>
+      <w:proofErr w:type="spellStart"/>
+      <w:r>
+        <w:rPr>
+          <w:b/>
+          <w:bCs/>
+          <w:lang w:val="en-US"/>
+        </w:rPr>
+        <w:t>formato</w:t>
+      </w:r>
+      <w:proofErr w:type="spellEnd"/>
+      <w:r>
+        <w:rPr>
+          <w:b/>
+          <w:bCs/>
+          <w:lang w:val="en-US"/>
+        </w:rPr>
+        <w:t xml:space="preserve"> 'a0', 'a1', </w:t>
       </w:r>
       <w:proofErr w:type="gramStart"/>
       <w:r>
         <w:rPr>
           <w:b/>
           <w:bCs/>
+          <w:lang w:val="en-US"/>
         </w:rPr>
         <w:t>...)\</w:t>
       </w:r>
@@ -1299,6 +1279,7 @@
         <w:rPr>
           <w:b/>
           <w:bCs/>
+          <w:lang w:val="en-US"/>
         </w:rPr>
         <w:t>n"</w:t>
       </w:r>
@@ -1314,6 +1295,7 @@
         <w:rPr>
           <w:b/>
           <w:bCs/>
+          <w:lang w:val="en-US"/>
         </w:rPr>
         <w:t xml:space="preserve">        </w:t>
       </w:r>
@@ -1857,6 +1839,9 @@
       <w:r>
         <w:t>Resultado</w:t>
       </w:r>
+      <w:r>
+        <w:t xml:space="preserve"> llama 3.1</w:t>
+      </w:r>
     </w:p>
     <w:p>
       <w:pPr>
@@ -2078,12 +2063,717 @@
         <w:pStyle w:val="Ttulo3"/>
       </w:pPr>
       <w:r>
+        <w:t xml:space="preserve">Resultado </w:t>
+      </w:r>
+      <w:proofErr w:type="spellStart"/>
+      <w:r>
+        <w:t>deepseek</w:t>
+      </w:r>
+      <w:proofErr w:type="spellEnd"/>
+    </w:p>
+    <w:p>
+      <w:pPr>
+        <w:rPr>
+          <w:b/>
+          <w:bCs/>
+        </w:rPr>
+      </w:pPr>
+      <w:r>
+        <w:rPr>
+          <w:b/>
+          <w:bCs/>
+        </w:rPr>
+        <w:t>las intenciones principales detectadas fueron:</w:t>
+      </w:r>
+    </w:p>
+    <w:p>
+      <w:r>
+        <w:t xml:space="preserve"> [{'id': 'a0', 'tipo': 'sumar', '</w:t>
+      </w:r>
+      <w:proofErr w:type="spellStart"/>
+      <w:r>
+        <w:t>parametros</w:t>
+      </w:r>
+      <w:proofErr w:type="spellEnd"/>
+      <w:r>
+        <w:t>': {'</w:t>
+      </w:r>
+      <w:proofErr w:type="spellStart"/>
+      <w:r>
+        <w:t>rango_horario_evera</w:t>
+      </w:r>
+      <w:proofErr w:type="spellEnd"/>
+      <w:r>
+        <w:t>': {'</w:t>
+      </w:r>
+      <w:proofErr w:type="spellStart"/>
+      <w:r>
+        <w:t>fecha_inicio</w:t>
+      </w:r>
+      <w:proofErr w:type="spellEnd"/>
+      <w:r>
+        <w:t>': '2025-5-14T23:00', '</w:t>
+      </w:r>
+      <w:proofErr w:type="spellStart"/>
+      <w:r>
+        <w:t>fecha_fin</w:t>
+      </w:r>
+      <w:proofErr w:type="spellEnd"/>
+      <w:r>
+        <w:t xml:space="preserve">': '2025-5-15T00:00'}}, 'dependencias': []}, </w:t>
+      </w:r>
+    </w:p>
+    <w:p>
+      <w:r>
+        <w:t>{'id': 'a1', 'tipo': 'sumar', '</w:t>
+      </w:r>
+      <w:proofErr w:type="spellStart"/>
+      <w:r>
+        <w:t>parametros</w:t>
+      </w:r>
+      <w:proofErr w:type="spellEnd"/>
+      <w:r>
+        <w:t>': {'</w:t>
+      </w:r>
+      <w:proofErr w:type="spellStart"/>
+      <w:r>
+        <w:t>rango_horario_lavadora</w:t>
+      </w:r>
+      <w:proofErr w:type="spellEnd"/>
+      <w:r>
+        <w:t>': {'</w:t>
+      </w:r>
+      <w:proofErr w:type="spellStart"/>
+      <w:r>
+        <w:t>fecha_inicio</w:t>
+      </w:r>
+      <w:proofErr w:type="spellEnd"/>
+      <w:r>
+        <w:t>': '2025-5-11T00:30', '</w:t>
+      </w:r>
+      <w:proofErr w:type="spellStart"/>
+      <w:r>
+        <w:t>fecha_fin</w:t>
+      </w:r>
+      <w:proofErr w:type="spellEnd"/>
+      <w:r>
+        <w:t xml:space="preserve">': '2025-5-11T01:00'}}, 'dependencias': []}, </w:t>
+      </w:r>
+    </w:p>
+    <w:p>
+      <w:r>
+        <w:t>{'id': 'a2', 'tipo': '</w:t>
+      </w:r>
+      <w:proofErr w:type="spellStart"/>
+      <w:r>
+        <w:t>calcular_max</w:t>
+      </w:r>
+      <w:proofErr w:type="spellEnd"/>
+      <w:r>
+        <w:t>', '</w:t>
+      </w:r>
+      <w:proofErr w:type="spellStart"/>
+      <w:r>
+        <w:t>parametros</w:t>
+      </w:r>
+      <w:proofErr w:type="spellEnd"/>
+      <w:r>
+        <w:t>': {'valores': [{'</w:t>
+      </w:r>
+      <w:proofErr w:type="spellStart"/>
+      <w:r>
+        <w:t>consumo_nevera</w:t>
+      </w:r>
+      <w:proofErr w:type="spellEnd"/>
+      <w:r>
+        <w:t>': 'a0.sum'}, {'</w:t>
+      </w:r>
+      <w:proofErr w:type="spellStart"/>
+      <w:r>
+        <w:t>consumo_lavadora</w:t>
+      </w:r>
+      <w:proofErr w:type="spellEnd"/>
+      <w:r>
+        <w:t>': 'a1.sum'}]}, 'dependencias': ['a0', 'a1']}]</w:t>
+      </w:r>
+    </w:p>
+    <w:p>
+      <w:pPr>
+        <w:rPr>
+          <w:b/>
+          <w:bCs/>
+        </w:rPr>
+      </w:pPr>
+      <w:r>
+        <w:rPr>
+          <w:b/>
+          <w:bCs/>
+        </w:rPr>
+        <w:t>el razonamiento realizado fue:</w:t>
+      </w:r>
+    </w:p>
+    <w:p>
+      <w:r>
+        <w:t xml:space="preserve"> El usuario solicita obtener el consumo de energía de dos dispositivos específicos en fechas y horarios determinados. Para ello, se utilizarán las herramientas sumar para calcular los consumos respectivos. Después de obtener ambos valores, se aplicará </w:t>
+      </w:r>
+      <w:proofErr w:type="spellStart"/>
+      <w:r>
+        <w:t>calcular_max</w:t>
+      </w:r>
+      <w:proofErr w:type="spellEnd"/>
+      <w:r>
+        <w:t xml:space="preserve"> para comparar cuál de ellos es mayor. No hay herramientas disponibles para obtener el consumo total de todos los dispositivos en un año ni para generar gráficas de consumo, por lo que se marcarán como no soportados.</w:t>
+      </w:r>
+    </w:p>
+    <w:p>
+      <w:pPr>
+        <w:pStyle w:val="Ttulo3"/>
+      </w:pPr>
+      <w:r>
+        <w:t>Resultado Mistral</w:t>
+      </w:r>
+    </w:p>
+    <w:p>
+      <w:pPr>
+        <w:rPr>
+          <w:b/>
+          <w:bCs/>
+        </w:rPr>
+      </w:pPr>
+      <w:r>
+        <w:rPr>
+          <w:b/>
+          <w:bCs/>
+        </w:rPr>
+        <w:t>las intenciones principales detectadas fueron:</w:t>
+      </w:r>
+    </w:p>
+    <w:p>
+      <w:r>
+        <w:t xml:space="preserve"> [{'id': 'a0', 'tipo': '</w:t>
+      </w:r>
+      <w:proofErr w:type="spellStart"/>
+      <w:r>
+        <w:t>consumo_rango_dias</w:t>
+      </w:r>
+      <w:proofErr w:type="spellEnd"/>
+      <w:r>
+        <w:t>', '</w:t>
+      </w:r>
+      <w:proofErr w:type="spellStart"/>
+      <w:r>
+        <w:t>parametros</w:t>
+      </w:r>
+      <w:proofErr w:type="spellEnd"/>
+      <w:r>
+        <w:t xml:space="preserve">': {'dispositivo': ['nevera', 'lavadora']}, 'dependencias': []}, </w:t>
+      </w:r>
+    </w:p>
+    <w:p>
+      <w:r>
+        <w:t>{'id': 'a1', 'tipo': '</w:t>
+      </w:r>
+      <w:proofErr w:type="spellStart"/>
+      <w:r>
+        <w:t>calcular_max</w:t>
+      </w:r>
+      <w:proofErr w:type="spellEnd"/>
+      <w:r>
+        <w:t>', '</w:t>
+      </w:r>
+      <w:proofErr w:type="spellStart"/>
+      <w:r>
+        <w:t>parametros</w:t>
+      </w:r>
+      <w:proofErr w:type="spellEnd"/>
+      <w:r>
+        <w:t>': {'consumos': ['a</w:t>
+      </w:r>
+      <w:proofErr w:type="gramStart"/>
+      <w:r>
+        <w:t>0.resultado</w:t>
+      </w:r>
+      <w:proofErr w:type="gramEnd"/>
+      <w:r>
+        <w:t xml:space="preserve">']}, 'dependencias': ['a0']}, </w:t>
+      </w:r>
+    </w:p>
+    <w:p>
+      <w:r>
+        <w:t>{'id': 'a2', 'tipo': '</w:t>
+      </w:r>
+      <w:proofErr w:type="spellStart"/>
+      <w:r>
+        <w:t>calcular_min</w:t>
+      </w:r>
+      <w:proofErr w:type="spellEnd"/>
+      <w:r>
+        <w:t>', '</w:t>
+      </w:r>
+      <w:proofErr w:type="spellStart"/>
+      <w:r>
+        <w:t>parametros</w:t>
+      </w:r>
+      <w:proofErr w:type="spellEnd"/>
+      <w:r>
+        <w:t>': {'consumos': ['a</w:t>
+      </w:r>
+      <w:proofErr w:type="gramStart"/>
+      <w:r>
+        <w:t>0.resultado</w:t>
+      </w:r>
+      <w:proofErr w:type="gramEnd"/>
+      <w:r>
+        <w:t xml:space="preserve">']}, 'dependencias': ['a0']}, </w:t>
+      </w:r>
+    </w:p>
+    <w:p>
+      <w:r>
+        <w:t>{'id': 'a3', 'tipo': 'sumar', '</w:t>
+      </w:r>
+      <w:proofErr w:type="spellStart"/>
+      <w:r>
+        <w:t>parametros</w:t>
+      </w:r>
+      <w:proofErr w:type="spellEnd"/>
+      <w:r>
+        <w:t>': {'valores': ['a</w:t>
+      </w:r>
+      <w:proofErr w:type="gramStart"/>
+      <w:r>
+        <w:t>1.resultado</w:t>
+      </w:r>
+      <w:proofErr w:type="gramEnd"/>
+      <w:r>
+        <w:t>', 'a</w:t>
+      </w:r>
+      <w:proofErr w:type="gramStart"/>
+      <w:r>
+        <w:t>2.resultado</w:t>
+      </w:r>
+      <w:proofErr w:type="gramEnd"/>
+      <w:r>
+        <w:t>']}, 'dependencias': ['a1', 'a2']}, {'id': 'a4', 'tipo': '</w:t>
+      </w:r>
+      <w:proofErr w:type="spellStart"/>
+      <w:r>
+        <w:t>consumo_rango_dias</w:t>
+      </w:r>
+      <w:proofErr w:type="spellEnd"/>
+      <w:r>
+        <w:t>', '</w:t>
+      </w:r>
+      <w:proofErr w:type="spellStart"/>
+      <w:r>
+        <w:t>parametros</w:t>
+      </w:r>
+      <w:proofErr w:type="spellEnd"/>
+      <w:r>
+        <w:t xml:space="preserve">': {'dispositivo': 'todos'}, 'dependencias': []}, </w:t>
+      </w:r>
+    </w:p>
+    <w:p>
+      <w:r>
+        <w:t>{'id': 'a5', 'tipo': '</w:t>
+      </w:r>
+      <w:proofErr w:type="spellStart"/>
+      <w:r>
+        <w:t>calcular_max</w:t>
+      </w:r>
+      <w:proofErr w:type="spellEnd"/>
+      <w:r>
+        <w:t>', '</w:t>
+      </w:r>
+      <w:proofErr w:type="spellStart"/>
+      <w:r>
+        <w:t>parametros</w:t>
+      </w:r>
+      <w:proofErr w:type="spellEnd"/>
+      <w:r>
+        <w:t>': {'consumos': ['a</w:t>
+      </w:r>
+      <w:proofErr w:type="gramStart"/>
+      <w:r>
+        <w:t>4.resultado</w:t>
+      </w:r>
+      <w:proofErr w:type="gramEnd"/>
+      <w:r>
+        <w:t xml:space="preserve">']}, 'dependencias': ['a4']}, </w:t>
+      </w:r>
+    </w:p>
+    <w:p>
+      <w:r>
+        <w:t>{'id': 'a6', 'tipo': '</w:t>
+      </w:r>
+      <w:proofErr w:type="spellStart"/>
+      <w:r>
+        <w:t>calcular_min</w:t>
+      </w:r>
+      <w:proofErr w:type="spellEnd"/>
+      <w:r>
+        <w:t>', '</w:t>
+      </w:r>
+      <w:proofErr w:type="spellStart"/>
+      <w:r>
+        <w:t>parametros</w:t>
+      </w:r>
+      <w:proofErr w:type="spellEnd"/>
+      <w:r>
+        <w:t>': {'consumos': ['a</w:t>
+      </w:r>
+      <w:proofErr w:type="gramStart"/>
+      <w:r>
+        <w:t>4.resultado</w:t>
+      </w:r>
+      <w:proofErr w:type="gramEnd"/>
+      <w:r>
+        <w:t xml:space="preserve">']}, 'dependencias': ['a4']}, </w:t>
+      </w:r>
+    </w:p>
+    <w:p>
+      <w:r>
+        <w:t>{'id': 'a7', 'tipo': 'sumar', '</w:t>
+      </w:r>
+      <w:proofErr w:type="spellStart"/>
+      <w:r>
+        <w:t>parametros</w:t>
+      </w:r>
+      <w:proofErr w:type="spellEnd"/>
+      <w:r>
+        <w:t>': {'valores': ['a</w:t>
+      </w:r>
+      <w:proofErr w:type="gramStart"/>
+      <w:r>
+        <w:t>5.resultado</w:t>
+      </w:r>
+      <w:proofErr w:type="gramEnd"/>
+      <w:r>
+        <w:t>', 'a</w:t>
+      </w:r>
+      <w:proofErr w:type="gramStart"/>
+      <w:r>
+        <w:t>6.resultado</w:t>
+      </w:r>
+      <w:proofErr w:type="gramEnd"/>
+      <w:r>
+        <w:t>']}, 'dependencias': ['a5', 'a6']}, {'id': 'a8', 'tipo': 'comparar', '</w:t>
+      </w:r>
+      <w:proofErr w:type="spellStart"/>
+      <w:r>
+        <w:t>parametros</w:t>
+      </w:r>
+      <w:proofErr w:type="spellEnd"/>
+      <w:r>
+        <w:t>': {'valor1': 'a</w:t>
+      </w:r>
+      <w:proofErr w:type="gramStart"/>
+      <w:r>
+        <w:t>3.resultado</w:t>
+      </w:r>
+      <w:proofErr w:type="gramEnd"/>
+      <w:r>
+        <w:t>', 'valor2': 'a</w:t>
+      </w:r>
+      <w:proofErr w:type="gramStart"/>
+      <w:r>
+        <w:t>7.resultado</w:t>
+      </w:r>
+      <w:proofErr w:type="gramEnd"/>
+      <w:r>
+        <w:t xml:space="preserve">'}, 'dependencias': ['a3', 'a7']}, </w:t>
+      </w:r>
+    </w:p>
+    <w:p>
+      <w:r>
+        <w:t>{'id': 'a9', 'tipo': '</w:t>
+      </w:r>
+      <w:proofErr w:type="spellStart"/>
+      <w:r>
+        <w:t>plan_inviable</w:t>
+      </w:r>
+      <w:proofErr w:type="spellEnd"/>
+      <w:r>
+        <w:t>', '</w:t>
+      </w:r>
+      <w:proofErr w:type="spellStart"/>
+      <w:r>
+        <w:t>parametros</w:t>
+      </w:r>
+      <w:proofErr w:type="spellEnd"/>
+      <w:r>
+        <w:t>': {'</w:t>
+      </w:r>
+      <w:proofErr w:type="spellStart"/>
+      <w:r>
+        <w:t>anio</w:t>
+      </w:r>
+      <w:proofErr w:type="spellEnd"/>
+      <w:r>
+        <w:t xml:space="preserve">': 2024}, 'dependencias': []}, </w:t>
+      </w:r>
+    </w:p>
+    <w:p>
+      <w:r>
+        <w:t>{'id': 'a10', 'tipo': '</w:t>
+      </w:r>
+      <w:proofErr w:type="spellStart"/>
+      <w:r>
+        <w:t>consumo_rango_meses</w:t>
+      </w:r>
+      <w:proofErr w:type="spellEnd"/>
+      <w:r>
+        <w:t>', '</w:t>
+      </w:r>
+      <w:proofErr w:type="spellStart"/>
+      <w:r>
+        <w:t>parametros</w:t>
+      </w:r>
+      <w:proofErr w:type="spellEnd"/>
+      <w:r>
+        <w:t>': {'dispositivo': 'todos', '</w:t>
+      </w:r>
+      <w:proofErr w:type="spellStart"/>
+      <w:r>
+        <w:t>anio</w:t>
+      </w:r>
+      <w:proofErr w:type="spellEnd"/>
+      <w:r>
+        <w:t xml:space="preserve">': 2024}, 'dependencias': ['a9']}, </w:t>
+      </w:r>
+    </w:p>
+    <w:p>
+      <w:r>
+        <w:t>{'id': 'a11', 'tipo': 'graficas', '</w:t>
+      </w:r>
+      <w:proofErr w:type="spellStart"/>
+      <w:r>
+        <w:t>parametros</w:t>
+      </w:r>
+      <w:proofErr w:type="spellEnd"/>
+      <w:r>
+        <w:t>': {'datos': ['a10.resultado']}, 'dependencias': ['a10']}]</w:t>
+      </w:r>
+    </w:p>
+    <w:p>
+      <w:pPr>
+        <w:rPr>
+          <w:b/>
+          <w:bCs/>
+        </w:rPr>
+      </w:pPr>
+      <w:r>
+        <w:rPr>
+          <w:b/>
+          <w:bCs/>
+        </w:rPr>
+        <w:t>el razonamiento realizado fue:</w:t>
+      </w:r>
+    </w:p>
+    <w:p>
+      <w:r>
+        <w:t xml:space="preserve"> Para responder a la pregunta del usuario, primero se necesita calcular el consumo de cada dispositivo en los días especificados (nevera y lavadora). Luego, se calculan el máximo y mínimo consumo para cada día. Después, se suman los máximos y mínimos de ambos días para obtener el total de consumo combinado. A continuación, se compara el total de consumo combinado con el total de consumo anual de todos los dispositivos para determinar cuál gastó más energía en esos dos días. Finalmente, se calcula el consumo mensual de todos los dispositivos en el año 2024 y se generan gráficas con los datos obtenidos.</w:t>
+      </w:r>
+    </w:p>
+    <w:p>
+      <w:pPr>
+        <w:pStyle w:val="Ttulo3"/>
+      </w:pPr>
+      <w:r>
+        <w:t>Resultado Gemma</w:t>
+      </w:r>
+    </w:p>
+    <w:p>
+      <w:pPr>
+        <w:rPr>
+          <w:b/>
+          <w:bCs/>
+        </w:rPr>
+      </w:pPr>
+      <w:r>
+        <w:rPr>
+          <w:b/>
+          <w:bCs/>
+        </w:rPr>
+        <w:t>las intenciones principales detectadas fueron:</w:t>
+      </w:r>
+    </w:p>
+    <w:p>
+      <w:r>
+        <w:t xml:space="preserve"> [{'id': 'a0', 'tipo': '</w:t>
+      </w:r>
+      <w:proofErr w:type="spellStart"/>
+      <w:r>
+        <w:t>consumo_rango_horas</w:t>
+      </w:r>
+      <w:proofErr w:type="spellEnd"/>
+      <w:r>
+        <w:t>', '</w:t>
+      </w:r>
+      <w:proofErr w:type="spellStart"/>
+      <w:r>
+        <w:t>paramametros</w:t>
+      </w:r>
+      <w:proofErr w:type="spellEnd"/>
+      <w:r>
+        <w:t>': {'</w:t>
+      </w:r>
+      <w:proofErr w:type="spellStart"/>
+      <w:r>
+        <w:t>fecha_inicio</w:t>
+      </w:r>
+      <w:proofErr w:type="spellEnd"/>
+      <w:r>
+        <w:t>': '2025-05-14 16:30', '</w:t>
+      </w:r>
+      <w:proofErr w:type="spellStart"/>
+      <w:r>
+        <w:t>fecha_fin</w:t>
+      </w:r>
+      <w:proofErr w:type="spellEnd"/>
+      <w:r>
+        <w:t xml:space="preserve">': '2025-05-15 16:30'}, 'dependencias': []}, </w:t>
+      </w:r>
+    </w:p>
+    <w:p>
+      <w:r>
+        <w:t>{'id': 'a1', 'tipo': '</w:t>
+      </w:r>
+      <w:proofErr w:type="spellStart"/>
+      <w:r>
+        <w:t>consumo_rango_dias</w:t>
+      </w:r>
+      <w:proofErr w:type="spellEnd"/>
+      <w:r>
+        <w:t>', '</w:t>
+      </w:r>
+      <w:proofErr w:type="spellStart"/>
+      <w:r>
+        <w:t>paramametros</w:t>
+      </w:r>
+      <w:proofErr w:type="spellEnd"/>
+      <w:r>
+        <w:t>': {'</w:t>
+      </w:r>
+      <w:proofErr w:type="spellStart"/>
+      <w:r>
+        <w:t>fecha_inicio</w:t>
+      </w:r>
+      <w:proofErr w:type="spellEnd"/>
+      <w:r>
+        <w:t>': '2025-05-13', '</w:t>
+      </w:r>
+      <w:proofErr w:type="spellStart"/>
+      <w:r>
+        <w:t>fecha_fin</w:t>
+      </w:r>
+      <w:proofErr w:type="spellEnd"/>
+      <w:r>
+        <w:t xml:space="preserve">': '2025-05-15'}, 'dependencias': []}, </w:t>
+      </w:r>
+    </w:p>
+    <w:p>
+      <w:r>
+        <w:t>{'id': 'a2', 'tipo': '</w:t>
+      </w:r>
+      <w:proofErr w:type="spellStart"/>
+      <w:r>
+        <w:t>consumo_rango_meses</w:t>
+      </w:r>
+      <w:proofErr w:type="spellEnd"/>
+      <w:r>
+        <w:t>', '</w:t>
+      </w:r>
+      <w:proofErr w:type="spellStart"/>
+      <w:r>
+        <w:t>paramametros</w:t>
+      </w:r>
+      <w:proofErr w:type="spellEnd"/>
+      <w:r>
+        <w:t>': {'año': 2024}, 'dependencias': []}]</w:t>
+      </w:r>
+    </w:p>
+    <w:p>
+      <w:pPr>
+        <w:rPr>
+          <w:b/>
+          <w:bCs/>
+        </w:rPr>
+      </w:pPr>
+      <w:r>
+        <w:rPr>
+          <w:b/>
+          <w:bCs/>
+        </w:rPr>
+        <w:t>el razonamiento realizado fue:</w:t>
+      </w:r>
+    </w:p>
+    <w:p>
+      <w:r>
+        <w:t xml:space="preserve"> Se identificaron herramientas para calcular el consumo de energía en diferentes rangos de tiempo. Las acciones '</w:t>
+      </w:r>
+      <w:proofErr w:type="spellStart"/>
+      <w:r>
+        <w:t>consumo_rango_horas</w:t>
+      </w:r>
+      <w:proofErr w:type="spellEnd"/>
+      <w:r>
+        <w:t>', '</w:t>
+      </w:r>
+      <w:proofErr w:type="spellStart"/>
+      <w:r>
+        <w:t>consumo_rango_dias</w:t>
+      </w:r>
+      <w:proofErr w:type="spellEnd"/>
+      <w:r>
+        <w:t>' y '</w:t>
+      </w:r>
+      <w:proofErr w:type="spellStart"/>
+      <w:r>
+        <w:t>consumo_rango_meses</w:t>
+      </w:r>
+      <w:proofErr w:type="spellEnd"/>
+      <w:r>
+        <w:t>' fueron las más relevantes para satisfacer las preguntas del usuario.</w:t>
+      </w:r>
+    </w:p>
+    <w:p>
+      <w:pPr>
+        <w:pStyle w:val="Ttulo3"/>
+      </w:pPr>
+      <w:r>
         <w:t>Análisis</w:t>
       </w:r>
     </w:p>
     <w:p>
       <w:r>
-        <w:t xml:space="preserve">Como se observa en el resultado, el modelo </w:t>
+        <w:t xml:space="preserve">Como se observa </w:t>
+      </w:r>
+      <w:r>
+        <w:t xml:space="preserve">los resultados de todos los modelos no fueron satisfactorios, se observa llamado a herramientas no existentes, utilización de herramientas no aptas para la tarea y obtención de parámetros bastante vaga y no los que se ingresan en las funciones. Aunque algunos modelos parecen responder mejor unos que otros, se comprobaron cada una de las entradas de la signatura, a excepción del </w:t>
+      </w:r>
+      <w:proofErr w:type="spellStart"/>
+      <w:r>
+        <w:t>feedback</w:t>
+      </w:r>
+      <w:proofErr w:type="spellEnd"/>
+      <w:r>
+        <w:t xml:space="preserve"> que intencionalmente se dejó vacío, se descubrió que el </w:t>
+      </w:r>
+      <w:proofErr w:type="spellStart"/>
+      <w:r>
+        <w:t>system_summary</w:t>
+      </w:r>
+      <w:proofErr w:type="spellEnd"/>
+      <w:r>
+        <w:t xml:space="preserve"> no se cargó correctamente, por lo tanto, los resultados de esta primera prueba esperablemente fueron no satisfactorios. Se procede a arreglar el error en la obtención del </w:t>
+      </w:r>
+      <w:proofErr w:type="spellStart"/>
+      <w:r>
+        <w:t>system_summary</w:t>
+      </w:r>
+      <w:proofErr w:type="spellEnd"/>
+      <w:r>
+        <w:t>.</w:t>
       </w:r>
     </w:p>
     <w:p>
@@ -2115,6 +2805,9 @@
     <w:p>
       <w:pPr>
         <w:pStyle w:val="Ttulo3"/>
+        <w:rPr>
+          <w:u w:val="single"/>
+        </w:rPr>
       </w:pPr>
       <w:r>
         <w:t>Análisis</w:t>
@@ -2813,6 +3506,7 @@
   <w:style w:type="character" w:default="1" w:styleId="Fuentedeprrafopredeter">
     <w:name w:val="Default Paragraph Font"/>
     <w:uiPriority w:val="1"/>
+    <w:semiHidden/>
     <w:unhideWhenUsed/>
   </w:style>
   <w:style w:type="table" w:default="1" w:styleId="Tablanormal">

</xml_diff>